<commit_message>
update thesis and PPT
</commit_message>
<xml_diff>
--- a/docs/V6_ALGORITHM_GUIDE.docx
+++ b/docs/V6_ALGORITHM_GUIDE.docx
@@ -7,7 +7,79 @@
         <w:pStyle w:val="Title"/>
       </w:pPr>
       <w:r>
-        <w:t xml:space="preserve">V6 Algorithm Guide</w:t>
+        <w:t xml:space="preserve">PPG</w:t>
+      </w:r>
+      <w:r>
+        <w:t xml:space="preserve"> </w:t>
+      </w:r>
+      <w:r>
+        <w:t xml:space="preserve">Frailty</w:t>
+      </w:r>
+      <w:r>
+        <w:t xml:space="preserve"> </w:t>
+      </w:r>
+      <w:r>
+        <w:t xml:space="preserve">Pipeline</w:t>
+      </w:r>
+      <w:r>
+        <w:t xml:space="preserve"> </w:t>
+      </w:r>
+      <w:r>
+        <w:t xml:space="preserve">V6:</w:t>
+      </w:r>
+      <w:r>
+        <w:t xml:space="preserve"> </w:t>
+      </w:r>
+      <w:r>
+        <w:t xml:space="preserve">A</w:t>
+      </w:r>
+      <w:r>
+        <w:t xml:space="preserve"> </w:t>
+      </w:r>
+      <w:r>
+        <w:t xml:space="preserve">Step-by-Step</w:t>
+      </w:r>
+      <w:r>
+        <w:t xml:space="preserve"> </w:t>
+      </w:r>
+      <w:r>
+        <w:t xml:space="preserve">Guide</w:t>
+      </w:r>
+      <w:r>
+        <w:t xml:space="preserve"> </w:t>
+      </w:r>
+      <w:r>
+        <w:t xml:space="preserve">to</w:t>
+      </w:r>
+      <w:r>
+        <w:t xml:space="preserve"> </w:t>
+      </w:r>
+      <w:r>
+        <w:t xml:space="preserve">Signal,</w:t>
+      </w:r>
+      <w:r>
+        <w:t xml:space="preserve"> </w:t>
+      </w:r>
+      <w:r>
+        <w:t xml:space="preserve">Quality,</w:t>
+      </w:r>
+      <w:r>
+        <w:t xml:space="preserve"> </w:t>
+      </w:r>
+      <w:r>
+        <w:t xml:space="preserve">and</w:t>
+      </w:r>
+      <w:r>
+        <w:t xml:space="preserve"> </w:t>
+      </w:r>
+      <w:r>
+        <w:t xml:space="preserve">Representation</w:t>
+      </w:r>
+      <w:r>
+        <w:t xml:space="preserve"> </w:t>
+      </w:r>
+      <w:r>
+        <w:t xml:space="preserve">Algorithms</w:t>
       </w:r>
     </w:p>
     <w:p>
@@ -157,19 +229,7 @@
         <w:pStyle w:val="FirstParagraph"/>
       </w:pPr>
       <w:r>
-        <w:t xml:space="preserve">Full paths are relative to</w:t>
-      </w:r>
-      <w:r>
-        <w:t xml:space="preserve"> </w:t>
-      </w:r>
-      <w:r>
-        <w:rPr>
-          <w:rStyle w:val="VerbatimChar"/>
-        </w:rPr>
-        <w:t xml:space="preserve">final_pipeline_v6/</w:t>
-      </w:r>
-      <w:r>
-        <w:t xml:space="preserve">. For example,</w:t>
+        <w:t xml:space="preserve">Full paths are relative to the repository root. For example,</w:t>
       </w:r>
       <w:r>
         <w:t xml:space="preserve"> </w:t>
@@ -214,7 +274,7 @@
         <w:t xml:space="preserve"> </w:t>
       </w:r>
       <w:r>
-        <w:t xml:space="preserve">paths are always relative to the V6 root. Line numbers refer to the source snapshot used when the guide was written. If code moves, locate the function or class named in the same section first. The appendix lists SHA-256 hashes of referenced source files to distinguish moved code from changed computations. These hashes are documentation provenance, not runtime environment locks or execution gates.</w:t>
+        <w:t xml:space="preserve">paths are always relative to the repository root. Line numbers refer to the documented source snapshot. If code moves, locate the function or class named in the same section first. The appendix lists SHA-256 hashes of referenced source files to distinguish moved code from changed computations. These hashes are documentation provenance, not runtime environment locks or execution gates.</w:t>
       </w:r>
     </w:p>
     <w:p>
@@ -1263,7 +1323,7 @@
         <w:pStyle w:val="FirstParagraph"/>
       </w:pPr>
       <w:r>
-        <w:t xml:space="preserve">This guide does not change source code, defaults, sampling rates, model weights, or data. Static checks of line references and formulas do not replace algorithm validation on real data or imply that every optional module has undergone a new execution test.</w:t>
+        <w:t xml:space="preserve">Source references and formulas do not replace algorithm validation on real data. Each optional module requires testing in its intended configuration.</w:t>
       </w:r>
     </w:p>
     <w:p>
@@ -2287,7 +2347,7 @@
         <w:t xml:space="preserve"> </w:t>
       </w:r>
       <w:r>
-        <w:t xml:space="preserve">function below does not mean the production entry automatically repairs missing data. The repair algorithm is a real reusable capability available through another eligible loader or direct calls; this explanation does not change entry-point behavior.</w:t>
+        <w:t xml:space="preserve">function below does not mean the production entry automatically repairs missing data. The repair algorithm is a reusable capability available through another eligible loader or direct calls.</w:t>
       </w:r>
     </w:p>
     <w:p>
@@ -6891,19 +6951,7 @@
         <w:t xml:space="preserve"> </w:t>
       </w:r>
       <w:r>
-        <w:t xml:space="preserve">only for valid orientation and finite σ, otherwise zero. This is not a correctness probability calibrated against class labels. The existence of this historical function does not prove completion of finalcase deployment/comparison protocols for the</w:t>
-      </w:r>
-      <w:r>
-        <w:t xml:space="preserve"> </w:t>
-      </w:r>
-      <w:r>
-        <w:t xml:space="preserve">“</w:t>
-      </w:r>
-      <w:r>
-        <w:t xml:space="preserve">no-B silent-calibration ablation.</w:t>
-      </w:r>
-      <w:r>
-        <w:t xml:space="preserve">”</w:t>
+        <w:t xml:space="preserve">only for valid orientation and finite σ, otherwise zero. This is not a correctness probability calibrated against class labels. Finalcase dynamic-recording inference requires same-participant B calibration; this standalone estimator does not provide a no-B inference route.</w:t>
       </w:r>
     </w:p>
     <w:p>
@@ -10871,7 +10919,7 @@
         <w:pStyle w:val="BodyText"/>
       </w:pPr>
       <w:r>
-        <w:t xml:space="preserve">This chapter explains source code, not a rerun-based validation report. SciPy filter design/polyphase coefficient generation and NumPy quantile internals are not reimplemented here; results depend on the installed dependency implementations. No algorithm is added or changed, and a function’s existence does not imply that every CLI/Dash combination exposes it. The cache chapter explains deterministic keys, stored content, and cross-fold leakage avoidance; later chapters cover quality scores, denoisers, and features.</w:t>
+        <w:t xml:space="preserve">Filter design, polyphase coefficient generation, and quantiles depend on the installed SciPy and NumPy implementations. A function’s existence does not imply that every CLI/Dash combination exposes it. The cache chapter explains deterministic keys, stored content, and cross-fold leakage avoidance; later chapters cover quality scores, denoisers, and features.</w:t>
       </w:r>
     </w:p>
     <w:p>
@@ -26342,7 +26390,7 @@
         <w:pStyle w:val="FirstParagraph"/>
       </w:pPr>
       <w:r>
-        <w:t xml:space="preserve">No library source is copied into the pipeline and no call is changed here. After dependency upgrades, check these default-kernel details against the newly installed source.</w:t>
+        <w:t xml:space="preserve">After dependency upgrades, check these default-kernel details against the newly installed source.</w:t>
       </w:r>
     </w:p>
     <w:p>
@@ -29052,7 +29100,7 @@
         <w:pStyle w:val="BodyText"/>
       </w:pPr>
       <w:r>
-        <w:t xml:space="preserve">This explains existing behavior: sharing recording lists does not make the statistical test paired, and the explanation does not change the algorithm.</w:t>
+        <w:t xml:space="preserve">Sharing recording lists does not make the statistical test paired.</w:t>
       </w:r>
     </w:p>
     <w:p>
@@ -45603,7 +45651,7 @@
         <w:pStyle w:val="FirstParagraph"/>
       </w:pPr>
       <w:r>
-        <w:t xml:space="preserve">This table lists the main algorithm files, configurations, and entry points discussed in the guide. Listing an entry point does not mean that the guide explains all of its training/reporting logic. Paths are relative to the V6 root. Line counts include comments and blank lines; their sum is not a count of added production code: this guide is documentation only.</w:t>
+        <w:t xml:space="preserve">This table lists the main algorithm files, configurations, and entry points discussed in the guide. Listing an entry point does not mean that the guide explains all of its training/reporting logic. Paths are relative to the repository root. Line counts include comments and blank lines.</w:t>
       </w:r>
     </w:p>
     <w:p>
@@ -45611,7 +45659,7 @@
         <w:pStyle w:val="BodyText"/>
       </w:pPr>
       <w:r>
-        <w:t xml:space="preserve">If a line reference no longer matches, search for the function name in the text, then compare the source digest below. SHA-256 identifies the documented source snapshot only; these digests do not participate in pipeline execution. The English V6 snapshot has refreshed file counts and digests; historical inline line ranges may shift as comments are translated, so function and class names remain the primary navigation anchors.</w:t>
+        <w:t xml:space="preserve">If a line reference no longer matches, search for the function or class name in the text, then compare the source digest below. SHA-256 identifies the documented source snapshot only; these digests do not participate in pipeline execution.</w:t>
       </w:r>
     </w:p>
     <w:tbl>
@@ -48850,7 +48898,7 @@
         <w:pStyle w:val="FirstParagraph"/>
       </w:pPr>
       <w:r>
-        <w:t xml:space="preserve">This guide explains the implemented algorithms; it neither proves their effectiveness nor reproduces every internal iteration of third-party libraries line by line. Unimplemented learned denoisers, external-backend internals, and unexecuted tests of optional branches do not become validated merely because they are described. Before changing an algorithm, separately confirm the research objective and numerical-equivalence requirements. Reading this guide does not change configurations or results.</w:t>
+        <w:t xml:space="preserve">Algorithm descriptions alone do not establish effectiveness. Third-party internals and optional branches require separate validation. The registered learned-denoiser aliases are unsupported placeholders, not implemented inference paths.</w:t>
       </w:r>
     </w:p>
     <w:sectPr/>

</xml_diff>